<commit_message>
Final 12x12 extended run (plateau stop at 135M further steps, 340/500 wins): refreshed registry, notes, README, trajectory
Co-Authored-By: Claude Sonnet 5.5 <noreply@anthropic.com>
</commit_message>
<xml_diff>
--- a/notes/05_win_challenge.docx
+++ b/notes/05_win_challenge.docx
@@ -1165,19 +1165,19 @@
                 <w:b/>
                 <w:bCs/>
               </w:rPr>
-              <w:t xml:space="preserve">22.4%</w:t>
-            </w:r>
-          </w:p>
-        </w:tc>
-        <w:tc>
-          <w:tcPr/>
-          <w:p>
-            <w:pPr>
-              <w:pStyle w:val="Compact"/>
-              <w:jc w:val="right"/>
-            </w:pPr>
-            <w:r>
-              <w:t xml:space="preserve">91.9 (65%)</w:t>
+              <w:t xml:space="preserve">68.0%</w:t>
+            </w:r>
+          </w:p>
+        </w:tc>
+        <w:tc>
+          <w:tcPr/>
+          <w:p>
+            <w:pPr>
+              <w:pStyle w:val="Compact"/>
+              <w:jc w:val="right"/>
+            </w:pPr>
+            <w:r>
+              <w:t xml:space="preserve">120.1 (85%)</w:t>
             </w:r>
           </w:p>
         </w:tc>
@@ -1201,30 +1201,30 @@
               <w:jc w:val="right"/>
             </w:pPr>
             <w:r>
-              <w:t xml:space="preserve">112 / 500</w:t>
-            </w:r>
-          </w:p>
-        </w:tc>
-        <w:tc>
-          <w:tcPr/>
-          <w:p>
-            <w:pPr>
-              <w:pStyle w:val="Compact"/>
-            </w:pPr>
-            <w:r>
-              <w:t xml:space="preserve">4 / 356 / 28</w:t>
-            </w:r>
-          </w:p>
-        </w:tc>
-        <w:tc>
-          <w:tcPr/>
-          <w:p>
-            <w:pPr>
-              <w:pStyle w:val="Compact"/>
-              <w:jc w:val="right"/>
-            </w:pPr>
-            <w:r>
-              <w:t xml:space="preserve">27.0 M</w:t>
+              <w:t xml:space="preserve">340 / 500</w:t>
+            </w:r>
+          </w:p>
+        </w:tc>
+        <w:tc>
+          <w:tcPr/>
+          <w:p>
+            <w:pPr>
+              <w:pStyle w:val="Compact"/>
+            </w:pPr>
+            <w:r>
+              <w:t xml:space="preserve">19 / 140 / 1</w:t>
+            </w:r>
+          </w:p>
+        </w:tc>
+        <w:tc>
+          <w:tcPr/>
+          <w:p>
+            <w:pPr>
+              <w:pStyle w:val="Compact"/>
+              <w:jc w:val="right"/>
+            </w:pPr>
+            <w:r>
+              <w:t xml:space="preserve">135.0 M</w:t>
             </w:r>
           </w:p>
         </w:tc>
@@ -4256,19 +4256,19 @@
                 <w:b/>
                 <w:bCs/>
               </w:rPr>
-              <w:t xml:space="preserve">22.4%</w:t>
-            </w:r>
-          </w:p>
-        </w:tc>
-        <w:tc>
-          <w:tcPr/>
-          <w:p>
-            <w:pPr>
-              <w:pStyle w:val="Compact"/>
-              <w:jc w:val="right"/>
-            </w:pPr>
-            <w:r>
-              <w:t xml:space="preserve">91.9 (65%)</w:t>
+              <w:t xml:space="preserve">68.0%</w:t>
+            </w:r>
+          </w:p>
+        </w:tc>
+        <w:tc>
+          <w:tcPr/>
+          <w:p>
+            <w:pPr>
+              <w:pStyle w:val="Compact"/>
+              <w:jc w:val="right"/>
+            </w:pPr>
+            <w:r>
+              <w:t xml:space="preserve">120.1 (85%)</w:t>
             </w:r>
           </w:p>
         </w:tc>
@@ -4292,30 +4292,30 @@
               <w:jc w:val="right"/>
             </w:pPr>
             <w:r>
-              <w:t xml:space="preserve">112 / 500</w:t>
-            </w:r>
-          </w:p>
-        </w:tc>
-        <w:tc>
-          <w:tcPr/>
-          <w:p>
-            <w:pPr>
-              <w:pStyle w:val="Compact"/>
-            </w:pPr>
-            <w:r>
-              <w:t xml:space="preserve">4 / 356 / 28</w:t>
-            </w:r>
-          </w:p>
-        </w:tc>
-        <w:tc>
-          <w:tcPr/>
-          <w:p>
-            <w:pPr>
-              <w:pStyle w:val="Compact"/>
-              <w:jc w:val="right"/>
-            </w:pPr>
-            <w:r>
-              <w:t xml:space="preserve">27.0 M</w:t>
+              <w:t xml:space="preserve">340 / 500</w:t>
+            </w:r>
+          </w:p>
+        </w:tc>
+        <w:tc>
+          <w:tcPr/>
+          <w:p>
+            <w:pPr>
+              <w:pStyle w:val="Compact"/>
+            </w:pPr>
+            <w:r>
+              <w:t xml:space="preserve">19 / 140 / 1</w:t>
+            </w:r>
+          </w:p>
+        </w:tc>
+        <w:tc>
+          <w:tcPr/>
+          <w:p>
+            <w:pPr>
+              <w:pStyle w:val="Compact"/>
+              <w:jc w:val="right"/>
+            </w:pPr>
+            <w:r>
+              <w:t xml:space="preserve">135.0 M</w:t>
             </w:r>
           </w:p>
         </w:tc>
@@ -5116,63 +5116,50 @@
               <w:pStyle w:val="Compact"/>
             </w:pPr>
             <w:r>
-              <w:t xml:space="preserve">the run above continued (extended run,</w:t>
-            </w:r>
-            <w:r>
-              <w:t xml:space="preserve"> </w:t>
-            </w:r>
+              <w:t xml:space="preserve">the run above continued (extended run, stopped by the plateau rule at 135 M further steps; validation-selected checkpoint)</w:t>
+            </w:r>
+          </w:p>
+        </w:tc>
+        <w:tc>
+          <w:tcPr/>
+          <w:p>
+            <w:pPr>
+              <w:pStyle w:val="Compact"/>
+            </w:pPr>
             <w:r>
               <w:rPr>
                 <w:b/>
                 <w:bCs/>
               </w:rPr>
-              <w:t xml:space="preserve">in progress</w:t>
-            </w:r>
-            <w:r>
-              <w:t xml:space="preserve">; snapshot at 25 M further steps)</w:t>
-            </w:r>
-          </w:p>
-        </w:tc>
-        <w:tc>
-          <w:tcPr/>
-          <w:p>
-            <w:pPr>
-              <w:pStyle w:val="Compact"/>
-            </w:pPr>
-            <w:r>
-              <w:rPr>
-                <w:b/>
-                <w:bCs/>
-              </w:rPr>
-              <w:t xml:space="preserve">22.4%</w:t>
+              <w:t xml:space="preserve">68.0%</w:t>
             </w:r>
             <w:r>
               <w:t xml:space="preserve"> </w:t>
             </w:r>
             <w:r>
-              <w:t xml:space="preserve">(112/500)</w:t>
-            </w:r>
-          </w:p>
-        </w:tc>
-        <w:tc>
-          <w:tcPr/>
-          <w:p>
-            <w:pPr>
-              <w:pStyle w:val="Compact"/>
-            </w:pPr>
-            <w:r>
-              <w:t xml:space="preserve">65%</w:t>
-            </w:r>
-          </w:p>
-        </w:tc>
-        <w:tc>
-          <w:tcPr/>
-          <w:p>
-            <w:pPr>
-              <w:pStyle w:val="Compact"/>
-            </w:pPr>
-            <w:r>
-              <w:t xml:space="preserve">first win at 12.5 M further steps</w:t>
+              <w:t xml:space="preserve">(340/500)</w:t>
+            </w:r>
+          </w:p>
+        </w:tc>
+        <w:tc>
+          <w:tcPr/>
+          <w:p>
+            <w:pPr>
+              <w:pStyle w:val="Compact"/>
+            </w:pPr>
+            <w:r>
+              <w:t xml:space="preserve">85%</w:t>
+            </w:r>
+          </w:p>
+        </w:tc>
+        <w:tc>
+          <w:tcPr/>
+          <w:p>
+            <w:pPr>
+              <w:pStyle w:val="Compact"/>
+            </w:pPr>
+            <w:r>
+              <w:t xml:space="preserve">first win at 12.5 M further steps; 70.0% (350/500) at best on the test set</w:t>
             </w:r>
           </w:p>
         </w:tc>
@@ -5254,7 +5241,7 @@
         <w:t xml:space="preserve"> </w:t>
       </w:r>
       <w:r>
-        <w:t xml:space="preserve">97% on 6×6, 89% on 8×8, 63% on 10×10 (after 32 M steps in total), and, after the extended run described below, 22% on 12×12 at the time of writing. The cost of a win grows quickly: a 12×12 win means 141 consecutive correct meals, and the training signal for the last few dozen only arrives in games that have already gone almost perfectly.</w:t>
+        <w:t xml:space="preserve">97% on 6×6, 89% on 8×8, 63% on 10×10 (after 32 M steps in total), and, after the extended run described below, 68% on 12×12 (340 of 500) at the end of writing. The cost of a win grows quickly: a 12×12 win means 141 consecutive correct meals, and the training signal for the last few dozen only arrives in games that have already gone almost perfectly.</w:t>
       </w:r>
     </w:p>
     <w:p>
@@ -6083,13 +6070,481 @@
           </w:p>
         </w:tc>
       </w:tr>
+      <w:tr>
+        <w:tc>
+          <w:tcPr/>
+          <w:p>
+            <w:pPr>
+              <w:pStyle w:val="Compact"/>
+            </w:pPr>
+            <w:r>
+              <w:t xml:space="preserve">37.5 M</w:t>
+            </w:r>
+          </w:p>
+        </w:tc>
+        <w:tc>
+          <w:tcPr/>
+          <w:p>
+            <w:pPr>
+              <w:pStyle w:val="Compact"/>
+            </w:pPr>
+            <w:r>
+              <w:t xml:space="preserve">98.4</w:t>
+            </w:r>
+          </w:p>
+        </w:tc>
+        <w:tc>
+          <w:tcPr/>
+          <w:p>
+            <w:pPr>
+              <w:pStyle w:val="Compact"/>
+            </w:pPr>
+            <w:r>
+              <w:t xml:space="preserve">70%</w:t>
+            </w:r>
+          </w:p>
+        </w:tc>
+        <w:tc>
+          <w:tcPr/>
+          <w:p>
+            <w:pPr>
+              <w:pStyle w:val="Compact"/>
+            </w:pPr>
+            <w:r>
+              <w:t xml:space="preserve">141</w:t>
+            </w:r>
+          </w:p>
+        </w:tc>
+        <w:tc>
+          <w:tcPr/>
+          <w:p>
+            <w:pPr>
+              <w:pStyle w:val="Compact"/>
+            </w:pPr>
+            <w:r>
+              <w:t xml:space="preserve">195</w:t>
+            </w:r>
+          </w:p>
+        </w:tc>
+      </w:tr>
+      <w:tr>
+        <w:tc>
+          <w:tcPr/>
+          <w:p>
+            <w:pPr>
+              <w:pStyle w:val="Compact"/>
+            </w:pPr>
+            <w:r>
+              <w:t xml:space="preserve">50 M</w:t>
+            </w:r>
+          </w:p>
+        </w:tc>
+        <w:tc>
+          <w:tcPr/>
+          <w:p>
+            <w:pPr>
+              <w:pStyle w:val="Compact"/>
+            </w:pPr>
+            <w:r>
+              <w:t xml:space="preserve">109.2</w:t>
+            </w:r>
+          </w:p>
+        </w:tc>
+        <w:tc>
+          <w:tcPr/>
+          <w:p>
+            <w:pPr>
+              <w:pStyle w:val="Compact"/>
+            </w:pPr>
+            <w:r>
+              <w:t xml:space="preserve">77%</w:t>
+            </w:r>
+          </w:p>
+        </w:tc>
+        <w:tc>
+          <w:tcPr/>
+          <w:p>
+            <w:pPr>
+              <w:pStyle w:val="Compact"/>
+            </w:pPr>
+            <w:r>
+              <w:t xml:space="preserve">141</w:t>
+            </w:r>
+          </w:p>
+        </w:tc>
+        <w:tc>
+          <w:tcPr/>
+          <w:p>
+            <w:pPr>
+              <w:pStyle w:val="Compact"/>
+            </w:pPr>
+            <w:r>
+              <w:t xml:space="preserve">258</w:t>
+            </w:r>
+          </w:p>
+        </w:tc>
+      </w:tr>
+      <w:tr>
+        <w:tc>
+          <w:tcPr/>
+          <w:p>
+            <w:pPr>
+              <w:pStyle w:val="Compact"/>
+            </w:pPr>
+            <w:r>
+              <w:t xml:space="preserve">62.5 M</w:t>
+            </w:r>
+          </w:p>
+        </w:tc>
+        <w:tc>
+          <w:tcPr/>
+          <w:p>
+            <w:pPr>
+              <w:pStyle w:val="Compact"/>
+            </w:pPr>
+            <w:r>
+              <w:t xml:space="preserve">114.2</w:t>
+            </w:r>
+          </w:p>
+        </w:tc>
+        <w:tc>
+          <w:tcPr/>
+          <w:p>
+            <w:pPr>
+              <w:pStyle w:val="Compact"/>
+            </w:pPr>
+            <w:r>
+              <w:t xml:space="preserve">81%</w:t>
+            </w:r>
+          </w:p>
+        </w:tc>
+        <w:tc>
+          <w:tcPr/>
+          <w:p>
+            <w:pPr>
+              <w:pStyle w:val="Compact"/>
+            </w:pPr>
+            <w:r>
+              <w:t xml:space="preserve">141</w:t>
+            </w:r>
+          </w:p>
+        </w:tc>
+        <w:tc>
+          <w:tcPr/>
+          <w:p>
+            <w:pPr>
+              <w:pStyle w:val="Compact"/>
+            </w:pPr>
+            <w:r>
+              <w:t xml:space="preserve">281</w:t>
+            </w:r>
+          </w:p>
+        </w:tc>
+      </w:tr>
+      <w:tr>
+        <w:tc>
+          <w:tcPr/>
+          <w:p>
+            <w:pPr>
+              <w:pStyle w:val="Compact"/>
+            </w:pPr>
+            <w:r>
+              <w:t xml:space="preserve">80 M</w:t>
+            </w:r>
+          </w:p>
+        </w:tc>
+        <w:tc>
+          <w:tcPr/>
+          <w:p>
+            <w:pPr>
+              <w:pStyle w:val="Compact"/>
+            </w:pPr>
+            <w:r>
+              <w:t xml:space="preserve">116.3</w:t>
+            </w:r>
+          </w:p>
+        </w:tc>
+        <w:tc>
+          <w:tcPr/>
+          <w:p>
+            <w:pPr>
+              <w:pStyle w:val="Compact"/>
+            </w:pPr>
+            <w:r>
+              <w:t xml:space="preserve">83%</w:t>
+            </w:r>
+          </w:p>
+        </w:tc>
+        <w:tc>
+          <w:tcPr/>
+          <w:p>
+            <w:pPr>
+              <w:pStyle w:val="Compact"/>
+            </w:pPr>
+            <w:r>
+              <w:t xml:space="preserve">141</w:t>
+            </w:r>
+          </w:p>
+        </w:tc>
+        <w:tc>
+          <w:tcPr/>
+          <w:p>
+            <w:pPr>
+              <w:pStyle w:val="Compact"/>
+            </w:pPr>
+            <w:r>
+              <w:t xml:space="preserve">312</w:t>
+            </w:r>
+          </w:p>
+        </w:tc>
+      </w:tr>
+      <w:tr>
+        <w:tc>
+          <w:tcPr/>
+          <w:p>
+            <w:pPr>
+              <w:pStyle w:val="Compact"/>
+            </w:pPr>
+            <w:r>
+              <w:t xml:space="preserve">90 M</w:t>
+            </w:r>
+          </w:p>
+        </w:tc>
+        <w:tc>
+          <w:tcPr/>
+          <w:p>
+            <w:pPr>
+              <w:pStyle w:val="Compact"/>
+            </w:pPr>
+            <w:r>
+              <w:t xml:space="preserve">118.7</w:t>
+            </w:r>
+          </w:p>
+        </w:tc>
+        <w:tc>
+          <w:tcPr/>
+          <w:p>
+            <w:pPr>
+              <w:pStyle w:val="Compact"/>
+            </w:pPr>
+            <w:r>
+              <w:t xml:space="preserve">84%</w:t>
+            </w:r>
+          </w:p>
+        </w:tc>
+        <w:tc>
+          <w:tcPr/>
+          <w:p>
+            <w:pPr>
+              <w:pStyle w:val="Compact"/>
+            </w:pPr>
+            <w:r>
+              <w:t xml:space="preserve">141</w:t>
+            </w:r>
+          </w:p>
+        </w:tc>
+        <w:tc>
+          <w:tcPr/>
+          <w:p>
+            <w:pPr>
+              <w:pStyle w:val="Compact"/>
+            </w:pPr>
+            <w:r>
+              <w:t xml:space="preserve">333</w:t>
+            </w:r>
+          </w:p>
+        </w:tc>
+      </w:tr>
+      <w:tr>
+        <w:tc>
+          <w:tcPr/>
+          <w:p>
+            <w:pPr>
+              <w:pStyle w:val="Compact"/>
+            </w:pPr>
+            <w:r>
+              <w:t xml:space="preserve">107.5 M</w:t>
+            </w:r>
+          </w:p>
+        </w:tc>
+        <w:tc>
+          <w:tcPr/>
+          <w:p>
+            <w:pPr>
+              <w:pStyle w:val="Compact"/>
+            </w:pPr>
+            <w:r>
+              <w:t xml:space="preserve">120.1</w:t>
+            </w:r>
+          </w:p>
+        </w:tc>
+        <w:tc>
+          <w:tcPr/>
+          <w:p>
+            <w:pPr>
+              <w:pStyle w:val="Compact"/>
+            </w:pPr>
+            <w:r>
+              <w:t xml:space="preserve">85%</w:t>
+            </w:r>
+          </w:p>
+        </w:tc>
+        <w:tc>
+          <w:tcPr/>
+          <w:p>
+            <w:pPr>
+              <w:pStyle w:val="Compact"/>
+            </w:pPr>
+            <w:r>
+              <w:t xml:space="preserve">141</w:t>
+            </w:r>
+          </w:p>
+        </w:tc>
+        <w:tc>
+          <w:tcPr/>
+          <w:p>
+            <w:pPr>
+              <w:pStyle w:val="Compact"/>
+            </w:pPr>
+            <w:r>
+              <w:t xml:space="preserve">350 (highest)</w:t>
+            </w:r>
+          </w:p>
+        </w:tc>
+      </w:tr>
+      <w:tr>
+        <w:tc>
+          <w:tcPr/>
+          <w:p>
+            <w:pPr>
+              <w:pStyle w:val="Compact"/>
+            </w:pPr>
+            <w:r>
+              <w:t xml:space="preserve">125 M</w:t>
+            </w:r>
+          </w:p>
+        </w:tc>
+        <w:tc>
+          <w:tcPr/>
+          <w:p>
+            <w:pPr>
+              <w:pStyle w:val="Compact"/>
+            </w:pPr>
+            <w:r>
+              <w:t xml:space="preserve">120.1</w:t>
+            </w:r>
+          </w:p>
+        </w:tc>
+        <w:tc>
+          <w:tcPr/>
+          <w:p>
+            <w:pPr>
+              <w:pStyle w:val="Compact"/>
+            </w:pPr>
+            <w:r>
+              <w:t xml:space="preserve">85%</w:t>
+            </w:r>
+          </w:p>
+        </w:tc>
+        <w:tc>
+          <w:tcPr/>
+          <w:p>
+            <w:pPr>
+              <w:pStyle w:val="Compact"/>
+            </w:pPr>
+            <w:r>
+              <w:t xml:space="preserve">141</w:t>
+            </w:r>
+          </w:p>
+        </w:tc>
+        <w:tc>
+          <w:tcPr/>
+          <w:p>
+            <w:pPr>
+              <w:pStyle w:val="Compact"/>
+            </w:pPr>
+            <w:r>
+              <w:t xml:space="preserve">340 (published)</w:t>
+            </w:r>
+          </w:p>
+        </w:tc>
+      </w:tr>
+      <w:tr>
+        <w:tc>
+          <w:tcPr/>
+          <w:p>
+            <w:pPr>
+              <w:pStyle w:val="Compact"/>
+            </w:pPr>
+            <w:r>
+              <w:t xml:space="preserve">135 M (end)</w:t>
+            </w:r>
+          </w:p>
+        </w:tc>
+        <w:tc>
+          <w:tcPr/>
+          <w:p>
+            <w:pPr>
+              <w:pStyle w:val="Compact"/>
+            </w:pPr>
+            <w:r>
+              <w:t xml:space="preserve">112.7</w:t>
+            </w:r>
+          </w:p>
+        </w:tc>
+        <w:tc>
+          <w:tcPr/>
+          <w:p>
+            <w:pPr>
+              <w:pStyle w:val="Compact"/>
+            </w:pPr>
+            <w:r>
+              <w:t xml:space="preserve">80%</w:t>
+            </w:r>
+          </w:p>
+        </w:tc>
+        <w:tc>
+          <w:tcPr/>
+          <w:p>
+            <w:pPr>
+              <w:pStyle w:val="Compact"/>
+            </w:pPr>
+            <w:r>
+              <w:t xml:space="preserve">141</w:t>
+            </w:r>
+          </w:p>
+        </w:tc>
+        <w:tc>
+          <w:tcPr/>
+          <w:p>
+            <w:pPr>
+              <w:pStyle w:val="Compact"/>
+            </w:pPr>
+            <w:r>
+              <w:t xml:space="preserve">303</w:t>
+            </w:r>
+          </w:p>
+        </w:tc>
+      </w:tr>
     </w:tbl>
     <w:p>
       <w:pPr>
         <w:pStyle w:val="FirstParagraph"/>
       </w:pPr>
       <w:r>
-        <w:t xml:space="preserve">This is a single run and a snapshot: the run continues (resumable, up to 200 M further steps, ending earlier if the win rate and fill both stop improving by more than 2 and 1 percentage points over 25 M steps). The interactive curves above are generated from the run’s files and show the current state when the notes are rebuilt. What it shows is that pure reinforcement learning, a masked PPO policy with a reachable-area input,</w:t>
+        <w:t xml:space="preserve">This is a single run (one seed). The win rate rose quickly up to about 50 M further steps, then slowly, and from about 90 M further steps it moved between 55% and 70% from one evaluation to the next (the standard error of a win rate measured on 500 games is about 2 percentage points, and the checkpoints themselves differ, so swings of this size are partly noise and partly real changes in the policy). The plateau rule stopped the run at 135 M further steps because neither the fill (85.1% against 85.2% before) nor the win rate (68.2% against 70.0%) had gained over the last 25 M steps. The published agent is the checkpoint with the best validation score (340 of 500 test wins, 68.0%); the single best test evaluation of the run was 350 of 500 (70.0%), which is not used as the headline because choosing the maximum over 50 noisy evaluations would flatter the result. Almost all remaining failures are self-collisions after the agent has filled most of the board (140 of 500 at the published checkpoint). The full evaluation-by-evaluation table is in</w:t>
+      </w:r>
+      <w:r>
+        <w:t xml:space="preserve"> </w:t>
+      </w:r>
+      <w:r>
+        <w:rPr>
+          <w:rStyle w:val="VerbatimChar"/>
+        </w:rPr>
+        <w:t xml:space="preserve">docs/12x12_trajectory.md</w:t>
+      </w:r>
+      <w:r>
+        <w:t xml:space="preserve">. What it shows is that pure reinforcement learning, a masked PPO policy with a reachable-area input,</w:t>
       </w:r>
       <w:r>
         <w:t xml:space="preserve"> </w:t>
@@ -6105,7 +6560,7 @@
         <w:t xml:space="preserve"> </w:t>
       </w:r>
       <w:r>
-        <w:t xml:space="preserve">fill the full 12×12 board on a laptop GPU, but it took on the order of 50 M environment steps in total, against none at all for the Hamiltonian cycle’s route to the same result (which learns nothing).</w:t>
+        <w:t xml:space="preserve">fill the full 12×12 board on a laptop GPU, but it took on the order of 150 M environment steps in total for about two-thirds of the games, against none at all for the Hamiltonian cycle’s route to the same result (which learns nothing).</w:t>
       </w:r>
     </w:p>
     <w:p>

</xml_diff>